<commit_message>
Update guides: replace placeholder screenshots with clickable reference URLs
- [스크린샷] 자리표시 텍스트를 실제 하이퍼링크(파란색 밑줄)로 교체
- Cursor 가이드: docs.cursor.com, daily.dev, bannerbear 등 10개 이상 참조 URL 추가
- Antigravity 가이드: antigravity.google, Codelab, Google 블로그 등 참조 URL 추가
- 참고 자료 섹션도 클릭 가능한 하이퍼링크로 업그레이드

https://claude.ai/code/session_01JD34izjRf5ivjg8fjpfu51
</commit_message>
<xml_diff>
--- a/Cursor_AI_사용가이드_초보자용.docx
+++ b/Cursor_AI_사용가이드_초보자용.docx
@@ -323,10 +323,30 @@
     <w:p>
       <w:r>
         <w:rPr>
+          <w:color w:val="444444"/>
+          <w:sz w:val="20"/>
+        </w:rPr>
+        <w:t xml:space="preserve">📸 Cursor 공식 홈페이지: </w:t>
+      </w:r>
+      <w:hyperlink r:id="rId9">
+        <w:r>
+          <w:rPr>
+            <w:color w:val="0563C1"/>
+            <w:u w:val="single"/>
+            <w:sz w:val="20"/>
+          </w:rPr>
+          <w:t>https://cursor.com</w:t>
+        </w:r>
+      </w:hyperlink>
+    </w:p>
+    <w:p>
+      <w:r>
+        <w:rPr>
           <w:i/>
-          <w:color w:val="999999"/>
+          <w:color w:val="888888"/>
+          <w:sz w:val="18"/>
         </w:rPr>
-        <w:t>[스크린샷] Cursor 공식 홈페이지 (cursor.com)</w:t>
+        <w:t xml:space="preserve">   (메인 페이지에서 Cursor의 전체 인터페이스와 기능 소개를 확인할 수 있습니다)</w:t>
       </w:r>
     </w:p>
     <w:p>
@@ -549,10 +569,30 @@
     <w:p>
       <w:r>
         <w:rPr>
+          <w:color w:val="444444"/>
+          <w:sz w:val="20"/>
+        </w:rPr>
+        <w:t xml:space="preserve">📸 다운로드 페이지: </w:t>
+      </w:r>
+      <w:hyperlink r:id="rId10">
+        <w:r>
+          <w:rPr>
+            <w:color w:val="0563C1"/>
+            <w:u w:val="single"/>
+            <w:sz w:val="20"/>
+          </w:rPr>
+          <w:t>https://www.cursor.com/downloads</w:t>
+        </w:r>
+      </w:hyperlink>
+    </w:p>
+    <w:p>
+      <w:r>
+        <w:rPr>
           <w:i/>
-          <w:color w:val="999999"/>
+          <w:color w:val="888888"/>
+          <w:sz w:val="18"/>
         </w:rPr>
-        <w:t>[스크린샷] cursor.com 메인 페이지의 Download 버튼 위치</w:t>
+        <w:t xml:space="preserve">   (OS별 다운로드 버튼이 있는 공식 다운로드 페이지)</w:t>
       </w:r>
     </w:p>
     <w:p>
@@ -580,10 +620,30 @@
     <w:p>
       <w:r>
         <w:rPr>
+          <w:color w:val="444444"/>
+          <w:sz w:val="20"/>
+        </w:rPr>
+        <w:t xml:space="preserve">📸 설치 과정 상세 가이드 (스크린샷 포함): </w:t>
+      </w:r>
+      <w:hyperlink r:id="rId11">
+        <w:r>
+          <w:rPr>
+            <w:color w:val="0563C1"/>
+            <w:u w:val="single"/>
+            <w:sz w:val="20"/>
+          </w:rPr>
+          <w:t>https://learn-cursor.com/en/wiki/user-guide/install</w:t>
+        </w:r>
+      </w:hyperlink>
+    </w:p>
+    <w:p>
+      <w:r>
+        <w:rPr>
           <w:i/>
-          <w:color w:val="999999"/>
+          <w:color w:val="888888"/>
+          <w:sz w:val="18"/>
         </w:rPr>
-        <w:t>[스크린샷] macOS에서 Cursor를 Applications로 드래그하는 화면</w:t>
+        <w:t xml:space="preserve">   (OS별 설치 과정의 단계별 스크린샷을 확인할 수 있습니다)</w:t>
       </w:r>
     </w:p>
     <w:p>
@@ -609,10 +669,30 @@
     <w:p>
       <w:r>
         <w:rPr>
+          <w:color w:val="444444"/>
+          <w:sz w:val="20"/>
+        </w:rPr>
+        <w:t xml:space="preserve">📸 첫 실행 및 로그인 가이드 (스크린샷 포함): </w:t>
+      </w:r>
+      <w:hyperlink r:id="rId12">
+        <w:r>
+          <w:rPr>
+            <w:color w:val="0563C1"/>
+            <w:u w:val="single"/>
+            <w:sz w:val="20"/>
+          </w:rPr>
+          <w:t>https://daily.dev/blog/setup-cursor-first-time</w:t>
+        </w:r>
+      </w:hyperlink>
+    </w:p>
+    <w:p>
+      <w:r>
+        <w:rPr>
           <w:i/>
-          <w:color w:val="999999"/>
+          <w:color w:val="888888"/>
+          <w:sz w:val="18"/>
         </w:rPr>
-        <w:t>[스크린샷] Cursor 로그인/가입 화면</w:t>
+        <w:t xml:space="preserve">   (로그인 화면, 초기 설정 등 단계별 스크린샷이 포함된 상세 가이드)</w:t>
       </w:r>
     </w:p>
     <w:p>
@@ -636,10 +716,30 @@
     <w:p>
       <w:r>
         <w:rPr>
+          <w:color w:val="444444"/>
+          <w:sz w:val="20"/>
+        </w:rPr>
+        <w:t xml:space="preserve">📸 초기 설정 화면 상세 (스크린샷 포함): </w:t>
+      </w:r>
+      <w:hyperlink r:id="rId13">
+        <w:r>
+          <w:rPr>
+            <w:color w:val="0563C1"/>
+            <w:u w:val="single"/>
+            <w:sz w:val="20"/>
+          </w:rPr>
+          <w:t>https://www.bannerbear.com/blog/how-to-get-started-with-cursor-ide-a-complete-setup-guide-for-developers/</w:t>
+        </w:r>
+      </w:hyperlink>
+    </w:p>
+    <w:p>
+      <w:r>
+        <w:rPr>
           <w:i/>
-          <w:color w:val="999999"/>
+          <w:color w:val="888888"/>
+          <w:sz w:val="18"/>
         </w:rPr>
-        <w:t>[스크린샷] 초기 설정 화면 (Import / Start from Scratch)</w:t>
+        <w:t xml:space="preserve">   (Import/Start from Scratch 선택 화면, 테마 선택 등 초기 설정 스크린샷)</w:t>
       </w:r>
     </w:p>
     <w:p>
@@ -794,10 +894,30 @@
     <w:p>
       <w:r>
         <w:rPr>
+          <w:color w:val="444444"/>
+          <w:sz w:val="20"/>
+        </w:rPr>
+        <w:t xml:space="preserve">📸 AI 모델 설정 공식 문서: </w:t>
+      </w:r>
+      <w:hyperlink r:id="rId14">
+        <w:r>
+          <w:rPr>
+            <w:color w:val="0563C1"/>
+            <w:u w:val="single"/>
+            <w:sz w:val="20"/>
+          </w:rPr>
+          <w:t>https://docs.cursor.com/settings/models</w:t>
+        </w:r>
+      </w:hyperlink>
+    </w:p>
+    <w:p>
+      <w:r>
+        <w:rPr>
           <w:i/>
-          <w:color w:val="999999"/>
+          <w:color w:val="888888"/>
+          <w:sz w:val="18"/>
         </w:rPr>
-        <w:t>[스크린샷] Cursor 설정에서 AI 모델 선택 화면</w:t>
+        <w:t xml:space="preserve">   (AI 모델 선택 및 설정 방법에 대한 공식 문서)</w:t>
       </w:r>
     </w:p>
     <w:p>
@@ -869,10 +989,30 @@
     <w:p>
       <w:r>
         <w:rPr>
+          <w:color w:val="444444"/>
+          <w:sz w:val="20"/>
+        </w:rPr>
+        <w:t xml:space="preserve">📸 Cursor 화면 구성 상세 (스크린샷 포함): </w:t>
+      </w:r>
+      <w:hyperlink r:id="rId15">
+        <w:r>
+          <w:rPr>
+            <w:color w:val="0563C1"/>
+            <w:u w:val="single"/>
+            <w:sz w:val="20"/>
+          </w:rPr>
+          <w:t>https://docs.cursor.com/get-started/overview</w:t>
+        </w:r>
+      </w:hyperlink>
+    </w:p>
+    <w:p>
+      <w:r>
+        <w:rPr>
           <w:i/>
-          <w:color w:val="999999"/>
+          <w:color w:val="888888"/>
+          <w:sz w:val="18"/>
         </w:rPr>
-        <w:t>[스크린샷] Cursor 전체 화면 구성 (사이드바, 편집영역, AI채팅, 터미널)]</w:t>
+        <w:t xml:space="preserve">   (Cursor의 전체 화면 레이아웃 및 각 영역 설명)</w:t>
       </w:r>
     </w:p>
     <w:p>
@@ -1063,6 +1203,35 @@
     </w:tbl>
     <w:p>
       <w:r>
+        <w:rPr>
+          <w:color w:val="444444"/>
+          <w:sz w:val="20"/>
+        </w:rPr>
+        <w:t xml:space="preserve">📸 AI 모드 공식 문서: </w:t>
+      </w:r>
+      <w:hyperlink r:id="rId16">
+        <w:r>
+          <w:rPr>
+            <w:color w:val="0563C1"/>
+            <w:u w:val="single"/>
+            <w:sz w:val="20"/>
+          </w:rPr>
+          <w:t>https://docs.cursor.com/chat/overview</w:t>
+        </w:r>
+      </w:hyperlink>
+    </w:p>
+    <w:p>
+      <w:r>
+        <w:rPr>
+          <w:i/>
+          <w:color w:val="888888"/>
+          <w:sz w:val="18"/>
+        </w:rPr>
+        <w:t xml:space="preserve">   (각 AI 모드의 상세 설명과 사용법)</w:t>
+      </w:r>
+    </w:p>
+    <w:p>
+      <w:r>
         <w:br w:type="page"/>
       </w:r>
     </w:p>
@@ -1097,10 +1266,30 @@
     <w:p>
       <w:r>
         <w:rPr>
+          <w:color w:val="444444"/>
+          <w:sz w:val="20"/>
+        </w:rPr>
+        <w:t xml:space="preserve">📸 Cursor Tab 기능 상세 (스크린샷 포함): </w:t>
+      </w:r>
+      <w:hyperlink r:id="rId17">
+        <w:r>
+          <w:rPr>
+            <w:color w:val="0563C1"/>
+            <w:u w:val="single"/>
+            <w:sz w:val="20"/>
+          </w:rPr>
+          <w:t>https://docs.cursor.com/tab/overview</w:t>
+        </w:r>
+      </w:hyperlink>
+    </w:p>
+    <w:p>
+      <w:r>
+        <w:rPr>
           <w:i/>
-          <w:color w:val="999999"/>
+          <w:color w:val="888888"/>
+          <w:sz w:val="18"/>
         </w:rPr>
-        <w:t>[스크린샷] Cursor Tab이 코드를 제안하는 모습 (회색 텍스트로 표시)]</w:t>
+        <w:t xml:space="preserve">   (Cursor Tab 자동완성 기능의 동작 방식과 스크린샷)</w:t>
       </w:r>
     </w:p>
     <w:p>
@@ -1125,6 +1314,35 @@
         <w:t xml:space="preserve">   예: "이 함수에 에러 처리를 추가해줘"</w:t>
         <w:br/>
         <w:t>4. AI가 선택 영역을 자동으로 수정합니다.</w:t>
+      </w:r>
+    </w:p>
+    <w:p>
+      <w:r>
+        <w:rPr>
+          <w:color w:val="444444"/>
+          <w:sz w:val="20"/>
+        </w:rPr>
+        <w:t xml:space="preserve">📸 Cmd+K 인라인 편집 상세: </w:t>
+      </w:r>
+      <w:hyperlink r:id="rId18">
+        <w:r>
+          <w:rPr>
+            <w:color w:val="0563C1"/>
+            <w:u w:val="single"/>
+            <w:sz w:val="20"/>
+          </w:rPr>
+          <w:t>https://docs.cursor.com/cmdk/overview</w:t>
+        </w:r>
+      </w:hyperlink>
+    </w:p>
+    <w:p>
+      <w:r>
+        <w:rPr>
+          <w:i/>
+          <w:color w:val="888888"/>
+          <w:sz w:val="18"/>
+        </w:rPr>
+        <w:t xml:space="preserve">   (Cmd+K 기능의 사용법 및 인라인 편집 스크린샷)</w:t>
       </w:r>
     </w:p>
     <w:p>
@@ -1182,10 +1400,30 @@
     <w:p>
       <w:r>
         <w:rPr>
+          <w:color w:val="444444"/>
+          <w:sz w:val="20"/>
+        </w:rPr>
+        <w:t xml:space="preserve">📸 @ 멘션 및 컨텍스트 기능 상세: </w:t>
+      </w:r>
+      <w:hyperlink r:id="rId19">
+        <w:r>
+          <w:rPr>
+            <w:color w:val="0563C1"/>
+            <w:u w:val="single"/>
+            <w:sz w:val="20"/>
+          </w:rPr>
+          <w:t>https://docs.cursor.com/chat/context</w:t>
+        </w:r>
+      </w:hyperlink>
+    </w:p>
+    <w:p>
+      <w:r>
+        <w:rPr>
           <w:i/>
-          <w:color w:val="999999"/>
+          <w:color w:val="888888"/>
+          <w:sz w:val="18"/>
         </w:rPr>
-        <w:t>[스크린샷] @ 멘션으로 파일을 참조하는 AI 채팅 화면</w:t>
+        <w:t xml:space="preserve">   (채팅에서 @ 기호로 파일, 폴더, 웹 등을 참조하는 방법 스크린샷)</w:t>
       </w:r>
     </w:p>
     <w:p>
@@ -1208,6 +1446,35 @@
         <w:t>• 에러 발생 시 자동으로 디버깅 및 재시도</w:t>
         <w:br/>
         <w:t>• 작업 진행 상황을 실시간으로 표시</w:t>
+      </w:r>
+    </w:p>
+    <w:p>
+      <w:r>
+        <w:rPr>
+          <w:color w:val="444444"/>
+          <w:sz w:val="20"/>
+        </w:rPr>
+        <w:t xml:space="preserve">📸 Agent 모드 공식 문서: </w:t>
+      </w:r>
+      <w:hyperlink r:id="rId20">
+        <w:r>
+          <w:rPr>
+            <w:color w:val="0563C1"/>
+            <w:u w:val="single"/>
+            <w:sz w:val="20"/>
+          </w:rPr>
+          <w:t>https://docs.cursor.com/chat/agent</w:t>
+        </w:r>
+      </w:hyperlink>
+    </w:p>
+    <w:p>
+      <w:r>
+        <w:rPr>
+          <w:i/>
+          <w:color w:val="888888"/>
+          <w:sz w:val="18"/>
+        </w:rPr>
+        <w:t xml:space="preserve">   (Agent 모드의 동작 방식과 기능 스크린샷)</w:t>
       </w:r>
     </w:p>
     <w:p>
@@ -1320,10 +1587,59 @@
     <w:p>
       <w:r>
         <w:rPr>
+          <w:color w:val="444444"/>
+          <w:sz w:val="20"/>
+        </w:rPr>
+        <w:t xml:space="preserve">📸 초보자 실습 튜토리얼 (영상 포함): </w:t>
+      </w:r>
+      <w:hyperlink r:id="rId21">
+        <w:r>
+          <w:rPr>
+            <w:color w:val="0563C1"/>
+            <w:u w:val="single"/>
+            <w:sz w:val="20"/>
+          </w:rPr>
+          <w:t>https://www.codecademy.com/article/how-to-use-cursor-ai-a-complete-guide-with-practical-examples</w:t>
+        </w:r>
+      </w:hyperlink>
+    </w:p>
+    <w:p>
+      <w:r>
+        <w:rPr>
           <w:i/>
-          <w:color w:val="999999"/>
+          <w:color w:val="888888"/>
+          <w:sz w:val="18"/>
         </w:rPr>
-        <w:t>[스크린샷] 완성된 계산기 앱이 브라우저에서 실행되는 모습</w:t>
+        <w:t xml:space="preserve">   (Cursor를 활용한 실전 프로젝트 예제와 단계별 스크린샷)</w:t>
+      </w:r>
+    </w:p>
+    <w:p>
+      <w:r>
+        <w:rPr>
+          <w:color w:val="444444"/>
+          <w:sz w:val="20"/>
+        </w:rPr>
+        <w:t xml:space="preserve">📸 Cursor 초보자 튜토리얼 2026: </w:t>
+      </w:r>
+      <w:hyperlink r:id="rId22">
+        <w:r>
+          <w:rPr>
+            <w:color w:val="0563C1"/>
+            <w:u w:val="single"/>
+            <w:sz w:val="20"/>
+          </w:rPr>
+          <w:t>https://www.nxcode.io/resources/news/cursor-tutorial-beginners-2026</w:t>
+        </w:r>
+      </w:hyperlink>
+    </w:p>
+    <w:p>
+      <w:r>
+        <w:rPr>
+          <w:i/>
+          <w:color w:val="888888"/>
+          <w:sz w:val="18"/>
+        </w:rPr>
+        <w:t xml:space="preserve">   (2026년 최신 Cursor 초보자 가이드 (스크린샷 다수 포함))</w:t>
       </w:r>
     </w:p>
     <w:p>
@@ -1489,6 +1805,35 @@
       </w:tr>
     </w:tbl>
     <w:p/>
+    <w:p>
+      <w:r>
+        <w:rPr>
+          <w:color w:val="444444"/>
+          <w:sz w:val="20"/>
+        </w:rPr>
+        <w:t xml:space="preserve">📸 요금제 상세 비교 페이지: </w:t>
+      </w:r>
+      <w:hyperlink r:id="rId23">
+        <w:r>
+          <w:rPr>
+            <w:color w:val="0563C1"/>
+            <w:u w:val="single"/>
+            <w:sz w:val="20"/>
+          </w:rPr>
+          <w:t>https://www.cursor.com/pricing</w:t>
+        </w:r>
+      </w:hyperlink>
+    </w:p>
+    <w:p>
+      <w:r>
+        <w:rPr>
+          <w:i/>
+          <w:color w:val="888888"/>
+          <w:sz w:val="18"/>
+        </w:rPr>
+        <w:t xml:space="preserve">   (각 플랜의 상세 기능 비교 및 최신 가격 정보)</w:t>
+      </w:r>
+    </w:p>
     <w:p>
       <w:r>
         <w:rPr>
@@ -1791,7 +2136,7 @@
         <w:pStyle w:val="Heading2"/>
       </w:pPr>
       <w:r>
-        <w:t>참고 자료</w:t>
+        <w:t>참고 자료 (스크린샷 포함 가이드)</w:t>
       </w:r>
     </w:p>
     <w:p>
@@ -1799,32 +2144,147 @@
         <w:pStyle w:val="ListBullet"/>
       </w:pPr>
       <w:r>
-        <w:t>공식 웹사이트: cursor.com</w:t>
+        <w:rPr>
+          <w:b/>
+        </w:rPr>
+        <w:t xml:space="preserve">공식 웹사이트: </w:t>
       </w:r>
+      <w:hyperlink r:id="rId9">
+        <w:r>
+          <w:rPr>
+            <w:color w:val="0563C1"/>
+            <w:u w:val="single"/>
+            <w:sz w:val="20"/>
+          </w:rPr>
+          <w:t>https://cursor.com</w:t>
+        </w:r>
+      </w:hyperlink>
     </w:p>
     <w:p>
       <w:pPr>
         <w:pStyle w:val="ListBullet"/>
       </w:pPr>
       <w:r>
-        <w:t>공식 문서: docs.cursor.com</w:t>
+        <w:rPr>
+          <w:b/>
+        </w:rPr>
+        <w:t xml:space="preserve">공식 문서 (스크린샷 포함): </w:t>
       </w:r>
+      <w:hyperlink r:id="rId24">
+        <w:r>
+          <w:rPr>
+            <w:color w:val="0563C1"/>
+            <w:u w:val="single"/>
+            <w:sz w:val="20"/>
+          </w:rPr>
+          <w:t>https://docs.cursor.com</w:t>
+        </w:r>
+      </w:hyperlink>
     </w:p>
     <w:p>
       <w:pPr>
         <w:pStyle w:val="ListBullet"/>
       </w:pPr>
       <w:r>
-        <w:t>Cursor 포럼: forum.cursor.com</w:t>
+        <w:rPr>
+          <w:b/>
+        </w:rPr>
+        <w:t xml:space="preserve">초보자 설치 가이드 (상세 스크린샷): </w:t>
       </w:r>
+      <w:hyperlink r:id="rId12">
+        <w:r>
+          <w:rPr>
+            <w:color w:val="0563C1"/>
+            <w:u w:val="single"/>
+            <w:sz w:val="20"/>
+          </w:rPr>
+          <w:t>https://daily.dev/blog/setup-cursor-first-time</w:t>
+        </w:r>
+      </w:hyperlink>
     </w:p>
     <w:p>
       <w:pPr>
         <w:pStyle w:val="ListBullet"/>
       </w:pPr>
       <w:r>
-        <w:t>초보자 튜토리얼: codecademy.com/article/how-to-use-cursor-ai</w:t>
+        <w:rPr>
+          <w:b/>
+        </w:rPr>
+        <w:t xml:space="preserve">완전 초보자 설정 가이드 (스크린샷 포함): </w:t>
       </w:r>
+      <w:hyperlink r:id="rId13">
+        <w:r>
+          <w:rPr>
+            <w:color w:val="0563C1"/>
+            <w:u w:val="single"/>
+            <w:sz w:val="20"/>
+          </w:rPr>
+          <w:t>https://www.bannerbear.com/blog/how-to-get-started-with-cursor-ide-a-complete-setup-guide-for-developers/</w:t>
+        </w:r>
+      </w:hyperlink>
+    </w:p>
+    <w:p>
+      <w:pPr>
+        <w:pStyle w:val="ListBullet"/>
+      </w:pPr>
+      <w:r>
+        <w:rPr>
+          <w:b/>
+        </w:rPr>
+        <w:t xml:space="preserve">Codecademy 실전 가이드: </w:t>
+      </w:r>
+      <w:hyperlink r:id="rId21">
+        <w:r>
+          <w:rPr>
+            <w:color w:val="0563C1"/>
+            <w:u w:val="single"/>
+            <w:sz w:val="20"/>
+          </w:rPr>
+          <w:t>https://www.codecademy.com/article/how-to-use-cursor-ai-a-complete-guide-with-practical-examples</w:t>
+        </w:r>
+      </w:hyperlink>
+    </w:p>
+    <w:p>
+      <w:pPr>
+        <w:pStyle w:val="ListBullet"/>
+      </w:pPr>
+      <w:r>
+        <w:rPr>
+          <w:b/>
+        </w:rPr>
+        <w:t xml:space="preserve">2026 최신 초보자 튜토리얼: </w:t>
+      </w:r>
+      <w:hyperlink r:id="rId22">
+        <w:r>
+          <w:rPr>
+            <w:color w:val="0563C1"/>
+            <w:u w:val="single"/>
+            <w:sz w:val="20"/>
+          </w:rPr>
+          <w:t>https://www.nxcode.io/resources/news/cursor-tutorial-beginners-2026</w:t>
+        </w:r>
+      </w:hyperlink>
+    </w:p>
+    <w:p>
+      <w:pPr>
+        <w:pStyle w:val="ListBullet"/>
+      </w:pPr>
+      <w:r>
+        <w:rPr>
+          <w:b/>
+        </w:rPr>
+        <w:t xml:space="preserve">Cursor 포럼 (커뮤니티): </w:t>
+      </w:r>
+      <w:hyperlink r:id="rId25">
+        <w:r>
+          <w:rPr>
+            <w:color w:val="0563C1"/>
+            <w:u w:val="single"/>
+            <w:sz w:val="20"/>
+          </w:rPr>
+          <w:t>https://forum.cursor.com</w:t>
+        </w:r>
+      </w:hyperlink>
     </w:p>
     <w:sectPr>
       <w:pgSz w:w="12240" w:h="15840"/>

</xml_diff>